<commit_message>
fix(templates): fix tax rows always rendering in default.docx
The {#showTax}/{/showTax} markers sat as raw XML text outside any
<w:t> run, so docxtemplater never recognized them as a section tag.
Every invoice generated with the default template showed literal
"{#showTax}"/"{/showTax}" text and always rendered the subtotal/tax
rows, even for 0%-tax clients. Move the markers inside the existing
text runs so the conditional actually works.

Co-Authored-By: Claude Sonnet 5 <noreply@anthropic.com>
</commit_message>
<xml_diff>
--- a/templates/default.docx
+++ b/templates/default.docx
@@ -590,7 +590,6 @@
         <w:gridCol w:w="2400"/>
         <w:gridCol w:w="2000"/>
       </w:tblGrid>
-      {#showTax}
       <w:tr>
         <w:tc>
           <w:tcPr>
@@ -623,7 +622,7 @@
                 <w:b/>
                 <w:bCs/>
               </w:rPr>
-              <w:t xml:space="preserve">{translations.subtotal}</w:t>
+              <w:t xml:space="preserve">{#showTax}{translations.subtotal}</w:t>
             </w:r>
           </w:p>
         </w:tc>
@@ -698,12 +697,11 @@
               <w:jc w:val="right"/>
             </w:pPr>
             <w:r>
-              <w:t xml:space="preserve">{tax}</w:t>
+              <w:t xml:space="preserve">{tax}{/showTax}</w:t>
             </w:r>
           </w:p>
         </w:tc>
       </w:tr>
-      {/showTax}
       <w:tr>
         <w:tc>
           <w:tcPr>

</xml_diff>

<commit_message>
feat(templates): render legal text and currency conversion note on invoices
Wires the legalText and conversionNote invoice-context fields into the
DOCX rendering pipeline: contextToTemplateData now exposes both as
plain (possibly empty) strings, and all three built-in templates
render them near the bottom of the invoice, matching the existing
taxNote pattern of rendering as blank when unset.

Co-Authored-By: Claude Sonnet 5 <noreply@anthropic.com>
</commit_message>
<xml_diff>
--- a/templates/default.docx
+++ b/templates/default.docx
@@ -800,6 +800,20 @@
     </w:p>
     <w:p>
       <w:pPr>
+        <w:spacing w:after="200"/>
+      </w:pPr>
+      <w:r>
+        <w:rPr>
+          <w:i/>
+          <w:iCs/>
+          <w:sz w:val="18"/>
+          <w:szCs w:val="18"/>
+        </w:rPr>
+        <w:t xml:space="preserve">{conversionNote}</w:t>
+      </w:r>
+    </w:p>
+    <w:p>
+      <w:pPr>
         <w:spacing w:after="400"/>
       </w:pPr>
       <w:r>
@@ -916,6 +930,19 @@
           <w:szCs w:val="20"/>
         </w:rPr>
         <w:t xml:space="preserve">{provider.vatId}</w:t>
+      </w:r>
+    </w:p>
+    <w:p>
+      <w:pPr>
+        <w:spacing w:before="300" w:after="100"/>
+      </w:pPr>
+      <w:r>
+        <w:rPr>
+          <w:sz w:val="18"/>
+          <w:szCs w:val="18"/>
+          <w:color w:val="666666"/>
+        </w:rPr>
+        <w:t xml:space="preserve">{legalText}</w:t>
       </w:r>
     </w:p>
     <w:sectPr>

</xml_diff>